<commit_message>
add link to show cv
</commit_message>
<xml_diff>
--- a/assets/files/Modar_Alhariri_Full_Stack_Web_Developer.docx
+++ b/assets/files/Modar_Alhariri_Full_Stack_Web_Developer.docx
@@ -68,7 +68,7 @@
         <w:rPr>
           <w:rStyle w:val="Hyperlink"/>
         </w:rPr>
-        <w:t>mailto:modaralhariri264@gmail.com</w:t>
+        <w:t>modaralhariri264@gmail.com</w:t>
       </w:r>
       <w:r>
         <w:fldChar w:fldCharType="end"/>
@@ -78,24 +78,61 @@
       </w:r>
       <w:r>
         <w:br/>
-        <w:t xml:space="preserve">LinkedIn: [LinkedIn </w:t>
       </w:r>
-      <w:proofErr w:type="gramStart"/>
+      <w:hyperlink r:id="rId6" w:history="1">
+        <w:r>
+          <w:rPr>
+            <w:rStyle w:val="Hyperlink"/>
+            <w:b/>
+            <w:bCs/>
+            <w:sz w:val="20"/>
+            <w:szCs w:val="20"/>
+          </w:rPr>
+          <w:t>LinkedIn</w:t>
+        </w:r>
+      </w:hyperlink>
       <w:r>
-        <w:t>URL]  |</w:t>
+        <w:rPr>
+          <w:b/>
+          <w:bCs/>
+          <w:sz w:val="20"/>
+          <w:szCs w:val="20"/>
+        </w:rPr>
+        <w:t xml:space="preserve"> |  </w:t>
       </w:r>
-      <w:proofErr w:type="gramEnd"/>
+      <w:hyperlink r:id="rId7" w:history="1">
+        <w:r>
+          <w:rPr>
+            <w:rStyle w:val="Hyperlink"/>
+            <w:b/>
+            <w:bCs/>
+            <w:sz w:val="20"/>
+            <w:szCs w:val="20"/>
+          </w:rPr>
+          <w:t xml:space="preserve">GitHub </w:t>
+        </w:r>
+      </w:hyperlink>
       <w:r>
-        <w:t xml:space="preserve">  GitHub: [GitHub </w:t>
+        <w:rPr>
+          <w:b/>
+          <w:bCs/>
+          <w:sz w:val="20"/>
+          <w:szCs w:val="20"/>
+        </w:rPr>
+        <w:t xml:space="preserve"> |  </w:t>
       </w:r>
-      <w:proofErr w:type="gramStart"/>
-      <w:r>
-        <w:t>URL]  |</w:t>
-      </w:r>
-      <w:proofErr w:type="gramEnd"/>
-      <w:r>
-        <w:t xml:space="preserve">  Portfolio: [Portfolio URL]</w:t>
-      </w:r>
+      <w:hyperlink r:id="rId8" w:history="1">
+        <w:r>
+          <w:rPr>
+            <w:rStyle w:val="Hyperlink"/>
+            <w:b/>
+            <w:bCs/>
+            <w:sz w:val="20"/>
+            <w:szCs w:val="20"/>
+          </w:rPr>
+          <w:t>Portfolio</w:t>
+        </w:r>
+      </w:hyperlink>
     </w:p>
     <w:p>
       <w:pPr>
@@ -434,20 +471,17 @@
         </w:pBdr>
         <w:spacing w:after="80"/>
       </w:pPr>
-      <w:proofErr w:type="gramStart"/>
-      <w:r>
-        <w:t>GitHub</w:t>
-      </w:r>
       <w:r>
         <w:t xml:space="preserve"> </w:t>
       </w:r>
-      <w:r>
-        <w:t xml:space="preserve"> |</w:t>
-      </w:r>
-      <w:proofErr w:type="gramEnd"/>
-      <w:r>
-        <w:t xml:space="preserve">  Live Demo</w:t>
-      </w:r>
+      <w:hyperlink r:id="rId9" w:history="1">
+        <w:r>
+          <w:rPr>
+            <w:rStyle w:val="Hyperlink"/>
+          </w:rPr>
+          <w:t>Live Demo</w:t>
+        </w:r>
+      </w:hyperlink>
     </w:p>
     <w:p>
       <w:pPr>
@@ -499,14 +533,7 @@
           <w:b/>
           <w:bCs/>
         </w:rPr>
-        <w:t xml:space="preserve">, </w:t>
-      </w:r>
-      <w:r>
-        <w:rPr>
-          <w:b/>
-          <w:bCs/>
-        </w:rPr>
-        <w:t xml:space="preserve">Local </w:t>
+        <w:t xml:space="preserve">, Local </w:t>
       </w:r>
       <w:proofErr w:type="gramStart"/>
       <w:r>
@@ -574,7 +601,7 @@
         </w:pBdr>
         <w:spacing w:after="80"/>
       </w:pPr>
-      <w:hyperlink r:id="rId6" w:history="1">
+      <w:hyperlink r:id="rId10" w:history="1">
         <w:r>
           <w:rPr>
             <w:rStyle w:val="Hyperlink"/>
@@ -585,7 +612,7 @@
       <w:r>
         <w:t xml:space="preserve"> |  </w:t>
       </w:r>
-      <w:hyperlink r:id="rId7" w:history="1">
+      <w:hyperlink r:id="rId11" w:history="1">
         <w:r>
           <w:rPr>
             <w:rStyle w:val="Hyperlink"/>
@@ -662,7 +689,7 @@
         </w:pBdr>
         <w:spacing w:after="80"/>
       </w:pPr>
-      <w:hyperlink r:id="rId8" w:history="1">
+      <w:hyperlink r:id="rId12" w:history="1">
         <w:r>
           <w:rPr>
             <w:rStyle w:val="Hyperlink"/>
@@ -673,24 +700,12 @@
       <w:r>
         <w:t xml:space="preserve"> |  </w:t>
       </w:r>
-      <w:hyperlink r:id="rId9" w:history="1">
+      <w:hyperlink r:id="rId13" w:history="1">
         <w:r>
           <w:rPr>
             <w:rStyle w:val="Hyperlink"/>
           </w:rPr>
-          <w:t>Live D</w:t>
-        </w:r>
-        <w:r>
-          <w:rPr>
-            <w:rStyle w:val="Hyperlink"/>
-          </w:rPr>
-          <w:t>e</w:t>
-        </w:r>
-        <w:r>
-          <w:rPr>
-            <w:rStyle w:val="Hyperlink"/>
-          </w:rPr>
-          <w:t>mo</w:t>
+          <w:t>Live Demo</w:t>
         </w:r>
       </w:hyperlink>
     </w:p>
@@ -1704,6 +1719,7 @@
   <w:style w:type="character" w:default="1" w:styleId="DefaultParagraphFont">
     <w:name w:val="Default Paragraph Font"/>
     <w:uiPriority w:val="1"/>
+    <w:semiHidden/>
     <w:unhideWhenUsed/>
   </w:style>
   <w:style w:type="table" w:default="1" w:styleId="TableNormal">

</xml_diff>